<commit_message>
Hoàn thiện bản cuối ba chương: phân tích SWOT Chương 3, sửa pháp lý Chương 1, tiểu kết
- Thư mục Ban_cuoi gồm Chương 1, 2, 3 cùng định dạng và tệp dữ liệu biểu đồ Chương 2
- Chương 1: sửa căn cứ Luật Giáo dục đại học 2025, nguồn sửa đổi Luật Sở hữu trí tuệ theo VBHN 67,
  Quyết định 1624, Thông tư 01/2024; bỏ khẳng định chưa đối chiếu được; thay sơ đồ ảnh bằng bảng
- Chương 3: Mục 3.1.2 phân tích điểm mạnh, điểm yếu, thời cơ, thách thức với ma trận và phương án kết hợp;
  khớp nội dung giải pháp với Chương 2; lộ trình theo mốc Thông tư 83/2026; tiểu kết
- Chương 2: tiểu kết

Co-Authored-By: Claude Opus 5.5 <noreply@anthropic.com>
Claude-Session: https://claude.ai/code/session_01ThGArqDrUUsqC1zG1BQvVL
</commit_message>
<xml_diff>
--- a/Chuong_3_He_thong_giai_phap_ra_soat.docx
+++ b/Chuong_3_He_thong_giai_phap_ra_soat.docx
@@ -133,7 +133,7 @@
         </w:rPr>
         <w:t xml:space="preserve">Luật Giáo dục đại học số 125/2025/QH15 đã mở rộng đáng kể quyền và nghĩa vụ của cơ sở giáo dục đại học trong lĩnh vực sở hữu trí tuệ. Cụ thể: </w:t>
       </w:r>
-      <w:del w:id="1001" w:author="Claude" w:date="2026-09-30T18:55:31Z">
+      <w:del w:id="1001" w:author="Claude" w:date="2026-09-30T19:14:55Z">
         <w:r>
           <w:rPr>
             <w:rFonts w:ascii="Times New Roman" w:hAnsi="Times New Roman" w:eastAsia="Times New Roman"/>
@@ -144,7 +144,7 @@
           <w:delText xml:space="preserve">Điều 27 quy định hoạt động khoa học, công nghệ, đổi mới sáng tạo và phát triển tài sản trí tuệ là một trong các chức năng cốt lõi của trường đại học;</w:delText>
         </w:r>
       </w:del>
-      <w:ins w:id="1002" w:author="Claude" w:date="2026-09-30T18:55:31Z">
+      <w:ins w:id="1002" w:author="Claude" w:date="2026-09-30T19:14:55Z">
         <w:r>
           <w:rPr>
             <w:rFonts w:ascii="Times New Roman" w:hAnsi="Times New Roman" w:eastAsia="Times New Roman"/>
@@ -164,7 +164,7 @@
         </w:rPr>
         <w:t xml:space="preserve"> Điều 28 khoản 1 khẳng định cơ sở giáo dục đại học được thành lập tổ chức khoa học công nghệ, doanh nghiệp khoa học công nghệ, doanh nghiệp quản lý tài sản trí tuệ và vốn đầu tư vào doanh nghiệp khoa học công nghệ. Đặc biệt, Điều 28 khoản 2 điểm d quy định quyền thực hiện định giá, xác lập quyền sở hữu, khai thác, góp vốn, phân chia lợi ích từ tài sản trí tuệ; </w:t>
       </w:r>
-      <w:del w:id="1003" w:author="Claude" w:date="2026-09-30T18:55:31Z">
+      <w:del w:id="1003" w:author="Claude" w:date="2026-09-30T19:14:55Z">
         <w:r>
           <w:rPr>
             <w:rFonts w:ascii="Times New Roman" w:hAnsi="Times New Roman" w:eastAsia="Times New Roman"/>
@@ -175,7 +175,7 @@
           <w:delText xml:space="preserve">Điều 28 khoản 2 điểm đ quy định nghĩa vụ công khai</w:delText>
         </w:r>
       </w:del>
-      <w:ins w:id="1004" w:author="Claude" w:date="2026-09-30T18:55:31Z">
+      <w:ins w:id="1004" w:author="Claude" w:date="2026-09-30T19:14:55Z">
         <w:r>
           <w:rPr>
             <w:rFonts w:ascii="Times New Roman" w:hAnsi="Times New Roman" w:eastAsia="Times New Roman"/>
@@ -195,7 +195,7 @@
         </w:rPr>
         <w:t xml:space="preserve"> năng lực, kết quả hoạt động khoa học, công nghệ và đổi mới sáng tạo và cập nhật hằng năm trên </w:t>
       </w:r>
-      <w:del w:id="1005" w:author="Claude" w:date="2026-09-30T18:55:31Z">
+      <w:del w:id="1005" w:author="Claude" w:date="2026-09-30T19:14:55Z">
         <w:r>
           <w:rPr>
             <w:rFonts w:ascii="Times New Roman" w:hAnsi="Times New Roman" w:eastAsia="Times New Roman"/>
@@ -206,7 +206,7 @@
           <w:delText xml:space="preserve">Nền tảng số quản lý khoa học, công nghệ và đổi mới sáng tạo quốc gia. Những quy định này</w:delText>
         </w:r>
       </w:del>
-      <w:ins w:id="1006" w:author="Claude" w:date="2026-09-30T18:55:31Z">
+      <w:ins w:id="1006" w:author="Claude" w:date="2026-09-30T19:14:55Z">
         <w:r>
           <w:rPr>
             <w:rFonts w:ascii="Times New Roman" w:hAnsi="Times New Roman" w:eastAsia="Times New Roman"/>
@@ -251,7 +251,7 @@
         </w:rPr>
         <w:t xml:space="preserve">Luật Khoa học, Công nghệ và Đổi mới sáng tạo số 93/2025/QH15 có hiệu lực thi hành từ ngày 01 tháng 10 năm 2025, </w:t>
       </w:r>
-      <w:del w:id="1007" w:author="Claude" w:date="2026-09-30T18:55:31Z">
+      <w:del w:id="1007" w:author="Claude" w:date="2026-09-30T19:14:55Z">
         <w:r>
           <w:rPr>
             <w:rFonts w:ascii="Times New Roman" w:hAnsi="Times New Roman" w:eastAsia="Times New Roman"/>
@@ -262,7 +262,7 @@
           <w:delText xml:space="preserve">tại khoản 7 Điều 71 đã sửa đổi Điều 135</w:delText>
         </w:r>
       </w:del>
-      <w:ins w:id="1008" w:author="Claude" w:date="2026-09-30T18:55:31Z">
+      <w:ins w:id="1008" w:author="Claude" w:date="2026-09-30T19:14:55Z">
         <w:r>
           <w:rPr>
             <w:rFonts w:ascii="Times New Roman" w:hAnsi="Times New Roman" w:eastAsia="Times New Roman"/>
@@ -282,7 +282,7 @@
         </w:rPr>
         <w:t xml:space="preserve"> Luật Sở hữu trí tuệ (thể hiện trong Văn bản hợp nhất số 67/VBHN-VPQH năm 2026), </w:t>
       </w:r>
-      <w:del w:id="1009" w:author="Claude" w:date="2026-09-30T18:55:31Z">
+      <w:del w:id="1009" w:author="Claude" w:date="2026-09-30T19:14:55Z">
         <w:r>
           <w:rPr>
             <w:rFonts w:ascii="Times New Roman" w:hAnsi="Times New Roman" w:eastAsia="Times New Roman"/>
@@ -293,7 +293,7 @@
           <w:delText xml:space="preserve">khẳng định chủ sở hữu có nghĩa vụ trả thù lao cho tác giả theo thỏa thuận; trường hợp không có thỏa thuận thì mức thù lao trả cho tác giả sáng chế tối thiểu là 30% lợi nhuận thuần mà chủ sở hữu thu được từ việc sử dụng sáng chế. Luật khẳng định ưu tiên cơ chế thỏa thuận và không đặt trần thù lao.</w:delText>
         </w:r>
       </w:del>
-      <w:ins w:id="1010" w:author="Claude" w:date="2026-09-30T18:55:31Z">
+      <w:ins w:id="1010" w:author="Claude" w:date="2026-09-30T19:14:55Z">
         <w:r>
           <w:rPr>
             <w:rFonts w:ascii="Times New Roman" w:hAnsi="Times New Roman" w:eastAsia="Times New Roman"/>
@@ -313,7 +313,7 @@
         </w:rPr>
         <w:t xml:space="preserve"> Do đó, </w:t>
       </w:r>
-      <w:del w:id="1011" w:author="Claude" w:date="2026-09-30T18:55:31Z">
+      <w:del w:id="1011" w:author="Claude" w:date="2026-09-30T19:14:55Z">
         <w:r>
           <w:rPr>
             <w:rFonts w:ascii="Times New Roman" w:hAnsi="Times New Roman" w:eastAsia="Times New Roman"/>
@@ -324,7 +324,7 @@
           <w:delText xml:space="preserve">mức giới hạn trần 100 triệu đồng tại Điều 36 Quyết định số 213/QĐ-ĐHTĐ</w:delText>
         </w:r>
       </w:del>
-      <w:ins w:id="1012" w:author="Claude" w:date="2026-09-30T18:55:31Z">
+      <w:ins w:id="1012" w:author="Claude" w:date="2026-09-30T19:14:55Z">
         <w:r>
           <w:rPr>
             <w:rFonts w:ascii="Times New Roman" w:hAnsi="Times New Roman" w:eastAsia="Times New Roman"/>
@@ -369,7 +369,7 @@
         </w:rPr>
         <w:t xml:space="preserve">Luật sửa đổi, bổ sung một số điều của Luật Sở hữu trí tuệ số 131/2025/QH15 có hiệu lực thi hành từ ngày 01 tháng 4 năm 2026, </w:t>
       </w:r>
-      <w:del w:id="1013" w:author="Claude" w:date="2026-09-30T18:55:31Z">
+      <w:del w:id="1013" w:author="Claude" w:date="2026-09-30T19:14:55Z">
         <w:r>
           <w:rPr>
             <w:rFonts w:ascii="Times New Roman" w:hAnsi="Times New Roman" w:eastAsia="Times New Roman"/>
@@ -380,7 +380,7 @@
           <w:delText xml:space="preserve">tại điểm c khoản 1 Điều 86 quy định tổ chức được giao quyền quản lý nhiệm vụ khoa học công nghệ sử dụng ngân sách nhà nước có quyền chủ động nộp đơn đăng ký xác lập quyền sở hữu độc quyền đối với sáng chế, kiểu dáng công nghiệp và thiết kế bố trí. Quy định này cho phép Nhà trường - với tư cách là tổ chức chủ trì nhiều đề tài có sử dụng ngân sách - có thể chủ động tiến hành đăng ký bảo hộ mà không cần chờ phê duyệt từ cơ quan giao nhiệm vụ, rút ngắn đáng kể thời gian từ khi phát sinh kết quả nghiên cứu đến khi nộp đơn.</w:delText>
         </w:r>
       </w:del>
-      <w:ins w:id="1014" w:author="Claude" w:date="2026-09-30T18:55:31Z">
+      <w:ins w:id="1014" w:author="Claude" w:date="2026-09-30T19:14:55Z">
         <w:r>
           <w:rPr>
             <w:rFonts w:ascii="Times New Roman" w:hAnsi="Times New Roman" w:eastAsia="Times New Roman"/>
@@ -407,7 +407,7 @@
         </w:rPr>
         <w:t xml:space="preserve">Thứ năm, </w:t>
       </w:r>
-      <w:del w:id="1015" w:author="Claude" w:date="2026-09-30T18:55:31Z">
+      <w:del w:id="1015" w:author="Claude" w:date="2026-09-30T19:14:55Z">
         <w:r>
           <w:rPr>
             <w:rFonts w:ascii="Times New Roman" w:hAnsi="Times New Roman" w:eastAsia="Times New Roman"/>
@@ -418,7 +418,7 @@
           <w:delText xml:space="preserve">Quyết định số 1624/QĐ-TTg của Thủ tướng Chính phủ phê duyệt sửa đổi</w:delText>
         </w:r>
       </w:del>
-      <w:ins w:id="1016" w:author="Claude" w:date="2026-09-30T18:55:31Z">
+      <w:ins w:id="1016" w:author="Claude" w:date="2026-09-30T19:14:55Z">
         <w:r>
           <w:rPr>
             <w:rFonts w:ascii="Times New Roman" w:hAnsi="Times New Roman" w:eastAsia="Times New Roman"/>
@@ -438,7 +438,7 @@
         </w:rPr>
         <w:t xml:space="preserve">, bổ sung Quyết định số 1068/QĐ-TTg về Chiến lược Sở hữu trí tuệ đến năm 2030 là văn bản có ý nghĩa đặc biệt quan trọng đối với hệ thống giáo dục đại học. </w:t>
       </w:r>
-      <w:del w:id="1017" w:author="Claude" w:date="2026-09-30T18:55:31Z">
+      <w:del w:id="1017" w:author="Claude" w:date="2026-09-30T19:14:55Z">
         <w:r>
           <w:rPr>
             <w:rFonts w:ascii="Times New Roman" w:hAnsi="Times New Roman" w:eastAsia="Times New Roman"/>
@@ -449,7 +449,7 @@
           <w:delText xml:space="preserve">Quyết định đặt ra 5 yêu cầu trực tiếp đối với cơ sở giáo dục đại học mà Nhà trường cần đáp ứng:</w:delText>
         </w:r>
       </w:del>
-      <w:ins w:id="1018" w:author="Claude" w:date="2026-09-30T18:55:31Z">
+      <w:ins w:id="1018" w:author="Claude" w:date="2026-09-30T19:14:55Z">
         <w:r>
           <w:rPr>
             <w:rFonts w:ascii="Times New Roman" w:hAnsi="Times New Roman" w:eastAsia="Times New Roman"/>
@@ -519,7 +519,7 @@
         </w:rPr>
         <w:t xml:space="preserve">Yêu cầu 2: </w:t>
       </w:r>
-      <w:del w:id="1019" w:author="Claude" w:date="2026-09-30T18:55:31Z">
+      <w:del w:id="1019" w:author="Claude" w:date="2026-09-30T19:14:55Z">
         <w:r>
           <w:rPr>
             <w:rFonts w:ascii="Times New Roman" w:hAnsi="Times New Roman" w:eastAsia="Times New Roman"/>
@@ -530,7 +530,7 @@
           <w:delText>Xác định trước các đối tượng quyền sở hữu trí tuệ cần đặt đối với kết quả nghiên cứu sử dụng ngân sách nhà nước ngay từ khâu đề xuất thuyết minh đề tài (điểm b khoản 4);</w:delText>
         </w:r>
       </w:del>
-      <w:ins w:id="1020" w:author="Claude" w:date="2026-09-30T18:55:31Z">
+      <w:ins w:id="1020" w:author="Claude" w:date="2026-09-30T19:14:55Z">
         <w:r>
           <w:rPr>
             <w:rFonts w:ascii="Times New Roman" w:hAnsi="Times New Roman" w:eastAsia="Times New Roman"/>
@@ -566,7 +566,7 @@
         </w:rPr>
         <w:t xml:space="preserve">Yêu cầu 3: </w:t>
       </w:r>
-      <w:del w:id="1021" w:author="Claude" w:date="2026-09-30T18:55:31Z">
+      <w:del w:id="1021" w:author="Claude" w:date="2026-09-30T19:14:55Z">
         <w:r>
           <w:rPr>
             <w:rFonts w:ascii="Times New Roman" w:hAnsi="Times New Roman" w:eastAsia="Times New Roman"/>
@@ -577,7 +577,7 @@
           <w:delText>Thúc đẩy hình thành các trung tâm đổi mới sáng tạo, trung tâm tư vấn định giá và ươm tạo tài sản trí tuệ từ khâu hình thành ý tưởng (điểm d khoản 4);</w:delText>
         </w:r>
       </w:del>
-      <w:ins w:id="1022" w:author="Claude" w:date="2026-09-30T18:55:31Z">
+      <w:ins w:id="1022" w:author="Claude" w:date="2026-09-30T19:14:55Z">
         <w:r>
           <w:rPr>
             <w:rFonts w:ascii="Times New Roman" w:hAnsi="Times New Roman" w:eastAsia="Times New Roman"/>
@@ -613,7 +613,7 @@
         </w:rPr>
         <w:t xml:space="preserve">Yêu cầu 4: </w:t>
       </w:r>
-      <w:del w:id="1023" w:author="Claude" w:date="2026-09-30T18:55:31Z">
+      <w:del w:id="1023" w:author="Claude" w:date="2026-09-30T19:14:55Z">
         <w:r>
           <w:rPr>
             <w:rFonts w:ascii="Times New Roman" w:hAnsi="Times New Roman" w:eastAsia="Times New Roman"/>
@@ -624,7 +624,7 @@
           <w:delText>Đưa sở hữu trí tuệ thành nội dung học bắt buộc trong chương trình đào tạo sinh viên khối kỹ thuật, công nghệ và các ngành liên quan (điểm h khoản 1);</w:delText>
         </w:r>
       </w:del>
-      <w:ins w:id="1024" w:author="Claude" w:date="2026-09-30T18:55:31Z">
+      <w:ins w:id="1024" w:author="Claude" w:date="2026-09-30T19:14:55Z">
         <w:r>
           <w:rPr>
             <w:rFonts w:ascii="Times New Roman" w:hAnsi="Times New Roman" w:eastAsia="Times New Roman"/>
@@ -660,7 +660,7 @@
         </w:rPr>
         <w:t xml:space="preserve">Yêu cầu 5: </w:t>
       </w:r>
-      <w:del w:id="1025" w:author="Claude" w:date="2026-09-30T18:55:31Z">
+      <w:del w:id="1025" w:author="Claude" w:date="2026-09-30T19:14:55Z">
         <w:r>
           <w:rPr>
             <w:rFonts w:ascii="Times New Roman" w:hAnsi="Times New Roman" w:eastAsia="Times New Roman"/>
@@ -671,7 +671,7 @@
           <w:delText>Phối hợp chuẩn bị cho Đề án gắn sở hữu trí tuệ với giáo dục đại học do Bộ Giáo dục và Đào tạo dự thảo vào quý 2 năm 2027.</w:delText>
         </w:r>
       </w:del>
-      <w:ins w:id="1026" w:author="Claude" w:date="2026-09-30T18:55:31Z">
+      <w:ins w:id="1026" w:author="Claude" w:date="2026-09-30T19:14:55Z">
         <w:r>
           <w:rPr>
             <w:rFonts w:ascii="Times New Roman" w:hAnsi="Times New Roman" w:eastAsia="Times New Roman"/>
@@ -698,7 +698,7 @@
         </w:rPr>
         <w:t xml:space="preserve">Bên cạnh đó, </w:t>
       </w:r>
-      <w:del w:id="1027" w:author="Claude" w:date="2026-09-30T18:55:31Z">
+      <w:del w:id="1027" w:author="Claude" w:date="2026-09-30T19:14:55Z">
         <w:r>
           <w:rPr>
             <w:rFonts w:ascii="Times New Roman" w:hAnsi="Times New Roman" w:eastAsia="Times New Roman"/>
@@ -709,7 +709,7 @@
           <w:delText xml:space="preserve">việc kết nối Mạng lưới Trung tâm Hỗ trợ công nghệ và đổi mới sáng tạo theo Quyết định số 1068/QĐ-TTg và Quyết định số 2205/QĐ-TTg giúp Nhà trường tiếp cận</w:delText>
         </w:r>
       </w:del>
-      <w:ins w:id="1028" w:author="Claude" w:date="2026-09-30T18:55:31Z">
+      <w:ins w:id="1028" w:author="Claude" w:date="2026-09-30T19:14:55Z">
         <w:r>
           <w:rPr>
             <w:rFonts w:ascii="Times New Roman" w:hAnsi="Times New Roman" w:eastAsia="Times New Roman"/>
@@ -745,7 +745,7 @@
         </w:rPr>
         <w:t xml:space="preserve">Thứ sáu, </w:t>
       </w:r>
-      <w:del w:id="1029" w:author="Claude" w:date="2026-09-30T18:55:31Z">
+      <w:del w:id="1029" w:author="Claude" w:date="2026-09-30T19:14:55Z">
         <w:r>
           <w:rPr>
             <w:rFonts w:ascii="Times New Roman" w:hAnsi="Times New Roman" w:eastAsia="Times New Roman"/>
@@ -756,7 +756,7 @@
           <w:delText xml:space="preserve">Chỉ thị số 02/CT-TTg của Thủ tướng Chính phủ về tăng cường thực thi quyền sở hữu trí tuệ yêu cầu ứng dụng công nghệ số, trí tuệ nhân tạo và kết nối cơ sở dữ liệu quốc gia về thực thi sở hữu trí tuệ đến năm 2026</w:delText>
         </w:r>
       </w:del>
-      <w:ins w:id="1030" w:author="Claude" w:date="2026-09-30T18:55:31Z">
+      <w:ins w:id="1030" w:author="Claude" w:date="2026-09-30T19:14:55Z">
         <w:r>
           <w:rPr>
             <w:rFonts w:ascii="Times New Roman" w:hAnsi="Times New Roman" w:eastAsia="Times New Roman"/>
@@ -783,10 +783,10 @@
         <w:ind w:firstLine="720"/>
         <w:jc w:val="both"/>
         <w:rPr>
-          <w:ins w:id="1031" w:author="Claude" w:date="2026-09-30T18:55:31Z"/>
+          <w:ins w:id="1031" w:author="Claude" w:date="2026-09-30T19:14:55Z"/>
         </w:rPr>
       </w:pPr>
-      <w:ins w:id="1032" w:author="Claude" w:date="2026-09-30T18:55:31Z">
+      <w:ins w:id="1032" w:author="Claude" w:date="2026-09-30T19:14:55Z">
         <w:r>
           <w:rPr>
             <w:rFonts w:ascii="Times New Roman" w:hAnsi="Times New Roman" w:eastAsia="Times New Roman"/>
@@ -804,10 +804,10 @@
         <w:ind w:firstLine="720"/>
         <w:jc w:val="both"/>
         <w:rPr>
-          <w:ins w:id="1033" w:author="Claude" w:date="2026-09-30T18:55:31Z"/>
+          <w:ins w:id="1033" w:author="Claude" w:date="2026-09-30T19:14:55Z"/>
         </w:rPr>
       </w:pPr>
-      <w:ins w:id="1034" w:author="Claude" w:date="2026-09-30T18:55:31Z">
+      <w:ins w:id="1034" w:author="Claude" w:date="2026-09-30T19:14:55Z">
         <w:r>
           <w:rPr>
             <w:rFonts w:ascii="Times New Roman" w:hAnsi="Times New Roman" w:eastAsia="Times New Roman"/>
@@ -825,10 +825,10 @@
         <w:ind w:firstLine="720"/>
         <w:jc w:val="both"/>
         <w:rPr>
-          <w:ins w:id="1035" w:author="Claude" w:date="2026-09-30T18:55:31Z"/>
+          <w:ins w:id="1035" w:author="Claude" w:date="2026-09-30T19:14:55Z"/>
         </w:rPr>
       </w:pPr>
-      <w:ins w:id="1036" w:author="Claude" w:date="2026-09-30T18:55:31Z">
+      <w:ins w:id="1036" w:author="Claude" w:date="2026-09-30T19:14:55Z">
         <w:r>
           <w:rPr>
             <w:rFonts w:ascii="Times New Roman" w:hAnsi="Times New Roman" w:eastAsia="Times New Roman"/>
@@ -846,10 +846,10 @@
         <w:ind w:firstLine="720"/>
         <w:jc w:val="both"/>
         <w:rPr>
-          <w:ins w:id="1037" w:author="Claude" w:date="2026-09-30T18:55:31Z"/>
+          <w:ins w:id="1037" w:author="Claude" w:date="2026-09-30T19:14:55Z"/>
         </w:rPr>
       </w:pPr>
-      <w:ins w:id="1038" w:author="Claude" w:date="2026-09-30T18:55:31Z">
+      <w:ins w:id="1038" w:author="Claude" w:date="2026-09-30T19:14:55Z">
         <w:r>
           <w:rPr>
             <w:rFonts w:ascii="Times New Roman" w:hAnsi="Times New Roman" w:eastAsia="Times New Roman"/>
@@ -867,7 +867,7 @@
         <w:ind w:firstLine="720"/>
         <w:jc w:val="both"/>
       </w:pPr>
-      <w:del w:id="1039" w:author="Claude" w:date="2026-09-30T18:55:31Z">
+      <w:del w:id="1039" w:author="Claude" w:date="2026-09-30T19:14:55Z">
         <w:r>
           <w:rPr>
             <w:rFonts w:ascii="Times New Roman" w:hAnsi="Times New Roman" w:eastAsia="Times New Roman"/>
@@ -878,7 +878,7 @@
           <w:delText>3.1.2. Các nguyên tắc xây dựng giải pháp</w:delText>
         </w:r>
       </w:del>
-      <w:ins w:id="1040" w:author="Claude" w:date="2026-09-30T18:55:31Z">
+      <w:ins w:id="1040" w:author="Claude" w:date="2026-09-30T19:14:55Z">
         <w:r>
           <w:rPr>
             <w:rFonts w:ascii="Times New Roman" w:hAnsi="Times New Roman" w:eastAsia="Times New Roman"/>
@@ -905,7 +905,7 @@
         </w:rPr>
         <w:t xml:space="preserve">Dữ liệu thực trạng tại Chương 2 phản ánh </w:t>
       </w:r>
-      <w:del w:id="1041" w:author="Claude" w:date="2026-09-30T18:55:31Z">
+      <w:del w:id="1041" w:author="Claude" w:date="2026-09-30T19:14:55Z">
         <w:r>
           <w:rPr>
             <w:rFonts w:ascii="Times New Roman" w:hAnsi="Times New Roman" w:eastAsia="Times New Roman"/>
@@ -916,7 +916,7 @@
           <w:delText xml:space="preserve">khoảng trống lớn về nhận thức và động lực</w:delText>
         </w:r>
       </w:del>
-      <w:ins w:id="1042" w:author="Claude" w:date="2026-09-30T18:55:31Z">
+      <w:ins w:id="1042" w:author="Claude" w:date="2026-09-30T19:14:55Z">
         <w:r>
           <w:rPr>
             <w:rFonts w:ascii="Times New Roman" w:hAnsi="Times New Roman" w:eastAsia="Times New Roman"/>
@@ -1149,7 +1149,7 @@
         </w:rPr>
         <w:t xml:space="preserve">Kết quả phân tích thực trạng tại Chương 2 cho thấy </w:t>
       </w:r>
-      <w:del w:id="1043" w:author="Claude" w:date="2026-09-30T18:55:31Z">
+      <w:del w:id="1043" w:author="Claude" w:date="2026-09-30T19:14:55Z">
         <w:r>
           <w:rPr>
             <w:rFonts w:ascii="Times New Roman" w:hAnsi="Times New Roman" w:eastAsia="Times New Roman"/>
@@ -1160,7 +1160,7 @@
           <w:delText xml:space="preserve">hiện nay Nhà trường đang vận hành đồng thời ba văn bản nội bộ (Quyết định số 213/QĐ-ĐHTĐ, Quyết định số 217/QĐ-ĐHTĐ và Quy chế chi tiêu nội bộ) với ba công thức chia lợi ích khác nhau, dẫn đến sự chồng chéo, mâu thuẫn trong áp dụng thực tế. Đồng thời, phạm vi các đối tượng được bảo hộ còn thiếu nhiều loại hình quan trọng như giải pháp hữu ích, sưu tập dữ liệu, bí mật kinh doanh, giáo trình số và nhãn hiệu các pháp nhân thành viên.</w:delText>
         </w:r>
       </w:del>
-      <w:ins w:id="1044" w:author="Claude" w:date="2026-09-30T18:55:31Z">
+      <w:ins w:id="1044" w:author="Claude" w:date="2026-09-30T19:14:55Z">
         <w:r>
           <w:rPr>
             <w:rFonts w:ascii="Times New Roman" w:hAnsi="Times New Roman" w:eastAsia="Times New Roman"/>
@@ -1243,7 +1243,7 @@
         </w:rPr>
         <w:t xml:space="preserve">- </w:t>
       </w:r>
-      <w:del w:id="1045" w:author="Claude" w:date="2026-09-30T18:55:31Z">
+      <w:del w:id="1045" w:author="Claude" w:date="2026-09-30T19:14:55Z">
         <w:r>
           <w:rPr>
             <w:rFonts w:ascii="Times New Roman" w:hAnsi="Times New Roman" w:eastAsia="Times New Roman"/>
@@ -1263,7 +1263,7 @@
           <w:delText xml:space="preserve">Bổ sung đầy đủ các đối tượng bảo hộ vào phạm vi điều chỉnh, bao gồm:</w:delText>
         </w:r>
       </w:del>
-      <w:ins w:id="1046" w:author="Claude" w:date="2026-09-30T18:55:31Z">
+      <w:ins w:id="1046" w:author="Claude" w:date="2026-09-30T19:14:55Z">
         <w:r>
           <w:rPr>
             <w:rFonts w:ascii="Times New Roman" w:hAnsi="Times New Roman" w:eastAsia="Times New Roman"/>
@@ -1308,7 +1308,7 @@
         </w:rPr>
         <w:t xml:space="preserve">Về cơ chế thù lao và phân chia lợi ích: </w:t>
       </w:r>
-      <w:del w:id="1049" w:author="Claude" w:date="2026-09-30T18:55:31Z">
+      <w:del w:id="1049" w:author="Claude" w:date="2026-09-30T19:14:55Z">
         <w:r>
           <w:rPr>
             <w:rFonts w:ascii="Times New Roman" w:hAnsi="Times New Roman" w:eastAsia="Times New Roman"/>
@@ -1319,7 +1319,7 @@
           <w:delText xml:space="preserve">Bãi bỏ mức trần thù lao 100 triệu đồng tại Điều 36 Quyết định số 213/QĐ-ĐHTĐ.</w:delText>
         </w:r>
       </w:del>
-      <w:ins w:id="1050" w:author="Claude" w:date="2026-09-30T18:55:31Z">
+      <w:ins w:id="1050" w:author="Claude" w:date="2026-09-30T19:14:55Z">
         <w:r>
           <w:rPr>
             <w:rFonts w:ascii="Times New Roman" w:hAnsi="Times New Roman" w:eastAsia="Times New Roman"/>
@@ -1339,7 +1339,7 @@
         </w:rPr>
         <w:t xml:space="preserve"> Áp dụng cơ chế thù lao theo thỏa thuận; </w:t>
       </w:r>
-      <w:del w:id="1047" w:author="Claude" w:date="2026-09-30T18:55:31Z">
+      <w:del w:id="1047" w:author="Claude" w:date="2026-09-30T19:14:55Z">
         <w:r>
           <w:rPr>
             <w:rFonts w:ascii="Times New Roman" w:hAnsi="Times New Roman" w:eastAsia="Times New Roman"/>
@@ -1350,7 +1350,7 @@
           <w:delText xml:space="preserve">trường hợp không có thỏa thuận thì áp dụng mức thù lao tối thiểu 30% lợi nhuận thuần theo quy định tại khoản 7 Điều 71 Luật Khoa học, Công nghệ và Đổi mới sáng tạo số 93/2025/QH15.</w:delText>
         </w:r>
       </w:del>
-      <w:ins w:id="1048" w:author="Claude" w:date="2026-09-30T18:55:31Z">
+      <w:ins w:id="1048" w:author="Claude" w:date="2026-09-30T19:14:55Z">
         <w:r>
           <w:rPr>
             <w:rFonts w:ascii="Times New Roman" w:hAnsi="Times New Roman" w:eastAsia="Times New Roman"/>
@@ -1478,7 +1478,7 @@
         </w:rPr>
         <w:t xml:space="preserve">Bộ phận Pháp chế (thuộc Trung tâm Dịch vụ và Quản trị hành chính tổng hợp) chủ trì soạn thảo dự thảo Quy chế. </w:t>
       </w:r>
-      <w:del w:id="1053" w:author="Claude" w:date="2026-09-30T18:55:31Z">
+      <w:del w:id="1053" w:author="Claude" w:date="2026-09-30T19:14:55Z">
         <w:r>
           <w:rPr>
             <w:rFonts w:ascii="Times New Roman" w:hAnsi="Times New Roman" w:eastAsia="Times New Roman"/>
@@ -1489,7 +1489,7 @@
           <w:delText xml:space="preserve">Phòng Quản lý Khoa học và Công nghệ</w:delText>
         </w:r>
       </w:del>
-      <w:ins w:id="1054" w:author="Claude" w:date="2026-09-30T18:55:31Z">
+      <w:ins w:id="1054" w:author="Claude" w:date="2026-09-30T19:14:55Z">
         <w:r>
           <w:rPr>
             <w:rFonts w:ascii="Times New Roman" w:hAnsi="Times New Roman" w:eastAsia="Times New Roman"/>
@@ -1549,7 +1549,7 @@
         </w:rPr>
         <w:t xml:space="preserve">Bố trí nguồn kinh phí tư vấn pháp lý chuyên sâu từ ngân sách thường xuyên cho việc thuê chuyên gia sở hữu trí tuệ tham gia rà soát dự thảo Quy chế. Rà soát đồng bộ Quy chế chi tiêu nội bộ và </w:t>
       </w:r>
-      <w:del w:id="1051" w:author="Claude" w:date="2026-09-30T18:55:31Z">
+      <w:del w:id="1051" w:author="Claude" w:date="2026-09-30T19:14:55Z">
         <w:r>
           <w:rPr>
             <w:rFonts w:ascii="Times New Roman" w:hAnsi="Times New Roman" w:eastAsia="Times New Roman"/>
@@ -1560,7 +1560,7 @@
           <w:delText xml:space="preserve">Điều lệ Quỹ Ngô Xuân Đỗ</w:delText>
         </w:r>
       </w:del>
-      <w:ins w:id="1052" w:author="Claude" w:date="2026-09-30T18:55:31Z">
+      <w:ins w:id="1052" w:author="Claude" w:date="2026-09-30T19:14:55Z">
         <w:r>
           <w:rPr>
             <w:rFonts w:ascii="Times New Roman" w:hAnsi="Times New Roman" w:eastAsia="Times New Roman"/>
@@ -1636,7 +1636,7 @@
         </w:rPr>
         <w:t xml:space="preserve">Thực trạng phân tích tại Chương 2 cho thấy chức năng quản lý sở hữu trí tuệ hiện đang được phân tán ở nhiều đầu mối: Bộ phận Pháp chế trực tiếp thực hiện các thủ tục pháp lý và lưu trữ, </w:t>
       </w:r>
-      <w:del w:id="1055" w:author="Claude" w:date="2026-09-30T18:55:31Z">
+      <w:del w:id="1055" w:author="Claude" w:date="2026-09-30T19:14:55Z">
         <w:r>
           <w:rPr>
             <w:rFonts w:ascii="Times New Roman" w:hAnsi="Times New Roman" w:eastAsia="Times New Roman"/>
@@ -1647,7 +1647,7 @@
           <w:delText xml:space="preserve">Phòng Quản lý Khoa học và Công nghệ</w:delText>
         </w:r>
       </w:del>
-      <w:ins w:id="1056" w:author="Claude" w:date="2026-09-30T18:55:31Z">
+      <w:ins w:id="1056" w:author="Claude" w:date="2026-09-30T19:14:55Z">
         <w:r>
           <w:rPr>
             <w:rFonts w:ascii="Times New Roman" w:hAnsi="Times New Roman" w:eastAsia="Times New Roman"/>
@@ -1667,7 +1667,7 @@
         </w:rPr>
         <w:t xml:space="preserve"> quản lý chỉ tiêu nghiên cứu, Trung tâm Tuyển sinh và Quản trị thương hiệu quản lý nhãn hiệu. </w:t>
       </w:r>
-      <w:del w:id="1071" w:author="Claude" w:date="2026-09-30T18:55:31Z">
+      <w:del w:id="1071" w:author="Claude" w:date="2026-09-30T19:14:55Z">
         <w:r>
           <w:rPr>
             <w:rFonts w:ascii="Times New Roman" w:hAnsi="Times New Roman" w:eastAsia="Times New Roman"/>
@@ -1678,7 +1678,7 @@
           <w:delText xml:space="preserve">Sự phân tán này dẫn đến thiếu đầu mối điều phối thống nhất</w:delText>
         </w:r>
       </w:del>
-      <w:ins w:id="1072" w:author="Claude" w:date="2026-09-30T18:55:31Z">
+      <w:ins w:id="1072" w:author="Claude" w:date="2026-09-30T19:14:55Z">
         <w:r>
           <w:rPr>
             <w:rFonts w:ascii="Times New Roman" w:hAnsi="Times New Roman" w:eastAsia="Times New Roman"/>
@@ -1971,7 +1971,7 @@
               <w:jc w:val="center"/>
             </w:pPr>
             <w:r/>
-            <w:del w:id="1063" w:author="Claude" w:date="2026-09-30T18:55:31Z">
+            <w:del w:id="1063" w:author="Claude" w:date="2026-09-30T19:14:55Z">
               <w:r>
                 <w:rPr>
                   <w:rFonts w:ascii="Times New Roman" w:hAnsi="Times New Roman" w:eastAsia="Times New Roman"/>
@@ -1984,7 +1984,7 @@
                 <w:delText>Khoa học và Công nghệ</w:delText>
               </w:r>
             </w:del>
-            <w:ins w:id="1064" w:author="Claude" w:date="2026-09-30T18:55:31Z">
+            <w:ins w:id="1064" w:author="Claude" w:date="2026-09-30T19:14:55Z">
               <w:r>
                 <w:rPr>
                   <w:rFonts w:ascii="Times New Roman" w:hAnsi="Times New Roman" w:eastAsia="Times New Roman"/>
@@ -2180,7 +2180,7 @@
               <w:jc w:val="center"/>
             </w:pPr>
             <w:r/>
-            <w:del w:id="1067" w:author="Claude" w:date="2026-09-30T18:55:31Z">
+            <w:del w:id="1067" w:author="Claude" w:date="2026-09-30T19:14:55Z">
               <w:r>
                 <w:rPr>
                   <w:rFonts w:ascii="Times New Roman" w:hAnsi="Times New Roman" w:eastAsia="Times New Roman"/>
@@ -2193,7 +2193,7 @@
                 <w:delText>Tài chính</w:delText>
               </w:r>
             </w:del>
-            <w:ins w:id="1068" w:author="Claude" w:date="2026-09-30T18:55:31Z">
+            <w:ins w:id="1068" w:author="Claude" w:date="2026-09-30T19:14:55Z">
               <w:r>
                 <w:rPr>
                   <w:rFonts w:ascii="Times New Roman" w:hAnsi="Times New Roman" w:eastAsia="Times New Roman"/>
@@ -2396,7 +2396,7 @@
         </w:rPr>
         <w:t xml:space="preserve">Phối hợp với Viện Nghiên cứu giáo dục và Chuyển giao tri thức xây dựng Đề án thành lập Trung tâm tư vấn, định giá và thương mại hóa tài sản trí tuệ trong trường, </w:t>
       </w:r>
-      <w:del w:id="1073" w:author="Claude" w:date="2026-09-30T18:55:31Z">
+      <w:del w:id="1073" w:author="Claude" w:date="2026-09-30T19:14:55Z">
         <w:r>
           <w:rPr>
             <w:rFonts w:ascii="Times New Roman" w:hAnsi="Times New Roman" w:eastAsia="Times New Roman"/>
@@ -2407,7 +2407,7 @@
           <w:delText xml:space="preserve">đáp ứng yêu cầu tại điểm d khoản 4 Quyết định số 1624/QĐ-TTg.</w:delText>
         </w:r>
       </w:del>
-      <w:ins w:id="1074" w:author="Claude" w:date="2026-09-30T18:55:31Z">
+      <w:ins w:id="1074" w:author="Claude" w:date="2026-09-30T19:14:55Z">
         <w:r>
           <w:rPr>
             <w:rFonts w:ascii="Times New Roman" w:hAnsi="Times New Roman" w:eastAsia="Times New Roman"/>
@@ -2467,7 +2467,7 @@
         </w:rPr>
         <w:t xml:space="preserve">Ban Giám hiệu ra quyết định kiện toàn bộ máy và ban hành quy chế phối hợp liên phòng ban. Bộ phận Pháp chế dự thảo quy chế phối hợp. </w:t>
       </w:r>
-      <w:del w:id="1069" w:author="Claude" w:date="2026-09-30T18:55:31Z">
+      <w:del w:id="1069" w:author="Claude" w:date="2026-09-30T19:14:55Z">
         <w:r>
           <w:rPr>
             <w:rFonts w:ascii="Times New Roman" w:hAnsi="Times New Roman" w:eastAsia="Times New Roman"/>
@@ -2478,7 +2478,7 @@
           <w:delText xml:space="preserve">Phòng Tổ chức Cán bộ</w:delText>
         </w:r>
       </w:del>
-      <w:ins w:id="1070" w:author="Claude" w:date="2026-09-30T18:55:31Z">
+      <w:ins w:id="1070" w:author="Claude" w:date="2026-09-30T19:14:55Z">
         <w:r>
           <w:rPr>
             <w:rFonts w:ascii="Times New Roman" w:hAnsi="Times New Roman" w:eastAsia="Times New Roman"/>
@@ -2659,7 +2659,7 @@
         </w:rPr>
         <w:t xml:space="preserve">Xác định trước đối tượng quyền sở hữu trí tuệ từ khâu đề xuất thuyết minh đề tài. Ngay tại mẫu thuyết minh đề tài cơ sở, bổ sung mục yêu cầu chủ nhiệm đề tài kê khai dự kiến đối tượng sở hữu trí tuệ có thể phát sinh (sáng chế, giải pháp hữu ích, quyền tác giả giáo trình, phần mềm) </w:t>
       </w:r>
-      <w:del w:id="1075" w:author="Claude" w:date="2026-09-30T18:55:31Z">
+      <w:del w:id="1075" w:author="Claude" w:date="2026-09-30T19:14:55Z">
         <w:r>
           <w:rPr>
             <w:rFonts w:ascii="Times New Roman" w:hAnsi="Times New Roman" w:eastAsia="Times New Roman"/>
@@ -2670,7 +2670,7 @@
           <w:delText xml:space="preserve">theo đúng yêu cầu tại điểm b khoản 4 Quyết định số 1624/QĐ-TTg.</w:delText>
         </w:r>
       </w:del>
-      <w:ins w:id="1076" w:author="Claude" w:date="2026-09-30T18:55:31Z">
+      <w:ins w:id="1076" w:author="Claude" w:date="2026-09-30T19:14:55Z">
         <w:r>
           <w:rPr>
             <w:rFonts w:ascii="Times New Roman" w:hAnsi="Times New Roman" w:eastAsia="Times New Roman"/>
@@ -2806,7 +2806,7 @@
         </w:rPr>
         <w:t xml:space="preserve">Soạn thảo và nộp đơn đăng ký xác lập quyền. Bộ phận Pháp chế soạn thảo bộ hồ sơ đăng ký và nộp đơn tại Cục Sở hữu trí tuệ hoặc Cục Bản quyền tác giả. Lưu ý đặc biệt: việc nộp đơn phải được hoàn thành </w:t>
       </w:r>
-      <w:del w:id="1077" w:author="Claude" w:date="2026-09-30T18:55:31Z">
+      <w:del w:id="1077" w:author="Claude" w:date="2026-09-30T19:14:55Z">
         <w:r>
           <w:rPr>
             <w:rFonts w:ascii="Times New Roman" w:hAnsi="Times New Roman" w:eastAsia="Times New Roman"/>
@@ -2817,7 +2817,7 @@
           <w:delText xml:space="preserve">trước hoặc cùng thời điểm công bố bài báo khoa học để tránh mất tính mới.</w:delText>
         </w:r>
       </w:del>
-      <w:ins w:id="1078" w:author="Claude" w:date="2026-09-30T18:55:31Z">
+      <w:ins w:id="1078" w:author="Claude" w:date="2026-09-30T19:14:55Z">
         <w:r>
           <w:rPr>
             <w:rFonts w:ascii="Times New Roman" w:hAnsi="Times New Roman" w:eastAsia="Times New Roman"/>
@@ -2909,7 +2909,7 @@
         <w:ind w:firstLine="720"/>
         <w:jc w:val="both"/>
       </w:pPr>
-      <w:del w:id="1057" w:author="Claude" w:date="2026-09-30T18:55:31Z">
+      <w:del w:id="1057" w:author="Claude" w:date="2026-09-30T19:14:55Z">
         <w:r>
           <w:rPr>
             <w:rFonts w:ascii="Times New Roman" w:hAnsi="Times New Roman" w:eastAsia="Times New Roman"/>
@@ -2920,7 +2920,7 @@
           <w:delText xml:space="preserve">Phòng Quản lý Khoa học và Công nghệ</w:delText>
         </w:r>
       </w:del>
-      <w:ins w:id="1058" w:author="Claude" w:date="2026-09-30T18:55:31Z">
+      <w:ins w:id="1058" w:author="Claude" w:date="2026-09-30T19:14:55Z">
         <w:r>
           <w:rPr>
             <w:rFonts w:ascii="Times New Roman" w:hAnsi="Times New Roman" w:eastAsia="Times New Roman"/>
@@ -3036,7 +3036,7 @@
         </w:rPr>
         <w:t xml:space="preserve">Một trong những nguyên nhân chủ quan quan trọng nhất khiến giảng viên chưa chủ động đăng ký bảo hộ sở hữu trí tuệ là rào cản về kinh phí nộp đơn và khoảng cách quá dài từ khi nộp đơn đến khi nhận được thù lao khen thưởng. Chi phí nộp đơn đăng ký sáng chế tại Cục Sở hữu trí tuệ dao động từ 3 đến 5 triệu đồng (chưa bao gồm phí thuê đại diện sở hữu công nghiệp), </w:t>
       </w:r>
-      <w:del w:id="1079" w:author="Claude" w:date="2026-09-30T18:55:31Z">
+      <w:del w:id="1079" w:author="Claude" w:date="2026-09-30T19:14:55Z">
         <w:r>
           <w:rPr>
             <w:rFonts w:ascii="Times New Roman" w:hAnsi="Times New Roman" w:eastAsia="Times New Roman"/>
@@ -3047,7 +3047,7 @@
           <w:delText xml:space="preserve">trong khi giảng viên phải tự bỏ kinh phí và chờ đợi</w:delText>
         </w:r>
       </w:del>
-      <w:ins w:id="1080" w:author="Claude" w:date="2026-09-30T18:55:31Z">
+      <w:ins w:id="1080" w:author="Claude" w:date="2026-09-30T19:14:55Z">
         <w:r>
           <w:rPr>
             <w:rFonts w:ascii="Times New Roman" w:hAnsi="Times New Roman" w:eastAsia="Times New Roman"/>
@@ -3116,7 +3116,7 @@
         </w:rPr>
         <w:t xml:space="preserve">Trích lập Dòng kinh phí hỗ trợ đăng ký sở hữu trí tuệ </w:t>
       </w:r>
-      <w:del w:id="1081" w:author="Claude" w:date="2026-09-30T18:55:31Z">
+      <w:del w:id="1081" w:author="Claude" w:date="2026-09-30T19:14:55Z">
         <w:r>
           <w:rPr>
             <w:rFonts w:ascii="Times New Roman" w:hAnsi="Times New Roman" w:eastAsia="Times New Roman"/>
@@ -3127,7 +3127,7 @@
           <w:delText xml:space="preserve">nằm trong Quỹ Phát triển khoa học công nghệ của Trường.</w:delText>
         </w:r>
       </w:del>
-      <w:ins w:id="1082" w:author="Claude" w:date="2026-09-30T18:55:31Z">
+      <w:ins w:id="1082" w:author="Claude" w:date="2026-09-30T19:14:55Z">
         <w:r>
           <w:rPr>
             <w:rFonts w:ascii="Times New Roman" w:hAnsi="Times New Roman" w:eastAsia="Times New Roman"/>
@@ -3172,7 +3172,7 @@
         </w:rPr>
         <w:t xml:space="preserve">Sửa đổi Quy chế chi tiêu nội bộ theo hướng </w:t>
       </w:r>
-      <w:del w:id="1083" w:author="Claude" w:date="2026-09-30T18:55:31Z">
+      <w:del w:id="1083" w:author="Claude" w:date="2026-09-30T19:14:55Z">
         <w:r>
           <w:rPr>
             <w:rFonts w:ascii="Times New Roman" w:hAnsi="Times New Roman" w:eastAsia="Times New Roman"/>
@@ -3183,7 +3183,7 @@
           <w:delText xml:space="preserve">cho phép chi trả ngay 50% định mức thưởng giờ nghiên cứu khoa học khi</w:delText>
         </w:r>
       </w:del>
-      <w:ins w:id="1084" w:author="Claude" w:date="2026-09-30T18:55:31Z">
+      <w:ins w:id="1084" w:author="Claude" w:date="2026-09-30T19:14:55Z">
         <w:r>
           <w:rPr>
             <w:rFonts w:ascii="Times New Roman" w:hAnsi="Times New Roman" w:eastAsia="Times New Roman"/>
@@ -3203,7 +3203,7 @@
         </w:rPr>
         <w:t xml:space="preserve"> Cục Sở hữu trí tuệ chấp nhận đơn hợp lệ (thay vì chờ đến khi cấp văn bằng bảo hộ). </w:t>
       </w:r>
-      <w:del w:id="1085" w:author="Claude" w:date="2026-09-30T18:55:31Z">
+      <w:del w:id="1085" w:author="Claude" w:date="2026-09-30T19:14:55Z">
         <w:r>
           <w:rPr>
             <w:rFonts w:ascii="Times New Roman" w:hAnsi="Times New Roman" w:eastAsia="Times New Roman"/>
@@ -3214,7 +3214,7 @@
           <w:delText xml:space="preserve">Phần 50% còn lại chi trả khi văn bằng</w:delText>
         </w:r>
       </w:del>
-      <w:ins w:id="1086" w:author="Claude" w:date="2026-09-30T18:55:31Z">
+      <w:ins w:id="1086" w:author="Claude" w:date="2026-09-30T19:14:55Z">
         <w:r>
           <w:rPr>
             <w:rFonts w:ascii="Times New Roman" w:hAnsi="Times New Roman" w:eastAsia="Times New Roman"/>
@@ -3290,7 +3290,7 @@
         <w:ind w:firstLine="720"/>
         <w:jc w:val="both"/>
       </w:pPr>
-      <w:del w:id="1065" w:author="Claude" w:date="2026-09-30T18:55:31Z">
+      <w:del w:id="1065" w:author="Claude" w:date="2026-09-30T19:14:55Z">
         <w:r>
           <w:rPr>
             <w:rFonts w:ascii="Times New Roman" w:hAnsi="Times New Roman" w:eastAsia="Times New Roman"/>
@@ -3301,7 +3301,7 @@
           <w:delText xml:space="preserve">Phòng Kế hoạch Tài chính</w:delText>
         </w:r>
       </w:del>
-      <w:ins w:id="1066" w:author="Claude" w:date="2026-09-30T18:55:31Z">
+      <w:ins w:id="1066" w:author="Claude" w:date="2026-09-30T19:14:55Z">
         <w:r>
           <w:rPr>
             <w:rFonts w:ascii="Times New Roman" w:hAnsi="Times New Roman" w:eastAsia="Times New Roman"/>
@@ -3408,7 +3408,7 @@
         <w:ind w:firstLine="720"/>
         <w:jc w:val="both"/>
       </w:pPr>
-      <w:del w:id="1087" w:author="Claude" w:date="2026-09-30T18:55:31Z">
+      <w:del w:id="1087" w:author="Claude" w:date="2026-09-30T19:14:55Z">
         <w:r>
           <w:rPr>
             <w:rFonts w:ascii="Times New Roman" w:hAnsi="Times New Roman" w:eastAsia="Times New Roman"/>
@@ -3419,7 +3419,7 @@
           <w:delText xml:space="preserve">Kết quả khảo sát thực trạng tại Chương 2 cho thấy nhận thức về sở hữu trí tuệ trong cộng đồng giảng viên và sinh viên Trường Đại học Thành Đô còn rất hạn chế. Số lượng giảng viên quan tâm và chủ động tìm hiểu về đăng ký bảo hộ sở hữu trí tuệ chỉ chiếm tỷ lệ nhỏ. Phần lớn giảng viên chưa phân biệt được sự khác nhau giữa sáng chế, giải pháp hữu ích và quyền tác giả; chưa nhận thức được rằng giáo trình, bài giảng số, phần mềm ứng dụng và cơ sở dữ liệu sưu tập đều là các đối tượng có thể được bảo hộ.</w:delText>
         </w:r>
       </w:del>
-      <w:ins w:id="1088" w:author="Claude" w:date="2026-09-30T18:55:31Z">
+      <w:ins w:id="1088" w:author="Claude" w:date="2026-09-30T19:14:55Z">
         <w:r>
           <w:rPr>
             <w:rFonts w:ascii="Times New Roman" w:hAnsi="Times New Roman" w:eastAsia="Times New Roman"/>
@@ -3439,7 +3439,7 @@
         </w:rPr>
         <w:t xml:space="preserve"> Giải pháp này nhằm khắc phục triệt để tình trạng trên, kích hoạt phong trào đăng ký bảo hộ trên diện rộng và </w:t>
       </w:r>
-      <w:del w:id="1089" w:author="Claude" w:date="2026-09-30T18:55:31Z">
+      <w:del w:id="1089" w:author="Claude" w:date="2026-09-30T19:14:55Z">
         <w:r>
           <w:rPr>
             <w:rFonts w:ascii="Times New Roman" w:hAnsi="Times New Roman" w:eastAsia="Times New Roman"/>
@@ -3450,7 +3450,7 @@
           <w:delText xml:space="preserve">đưa sở hữu trí tuệ thành môn học bắt buộc cho sinh viên theo Quyết định số 1624/QĐ-TTg.</w:delText>
         </w:r>
       </w:del>
-      <w:ins w:id="1090" w:author="Claude" w:date="2026-09-30T18:55:31Z">
+      <w:ins w:id="1090" w:author="Claude" w:date="2026-09-30T19:14:55Z">
         <w:r>
           <w:rPr>
             <w:rFonts w:ascii="Times New Roman" w:hAnsi="Times New Roman" w:eastAsia="Times New Roman"/>
@@ -3616,7 +3616,7 @@
         <w:ind w:firstLine="720"/>
         <w:jc w:val="both"/>
       </w:pPr>
-      <w:del w:id="1059" w:author="Claude" w:date="2026-09-30T18:55:31Z">
+      <w:del w:id="1059" w:author="Claude" w:date="2026-09-30T19:14:55Z">
         <w:r>
           <w:rPr>
             <w:rFonts w:ascii="Times New Roman" w:hAnsi="Times New Roman" w:eastAsia="Times New Roman"/>
@@ -3627,7 +3627,7 @@
           <w:delText xml:space="preserve">Phòng Quản lý Khoa học và Công nghệ</w:delText>
         </w:r>
       </w:del>
-      <w:ins w:id="1060" w:author="Claude" w:date="2026-09-30T18:55:31Z">
+      <w:ins w:id="1060" w:author="Claude" w:date="2026-09-30T19:14:55Z">
         <w:r>
           <w:rPr>
             <w:rFonts w:ascii="Times New Roman" w:hAnsi="Times New Roman" w:eastAsia="Times New Roman"/>
@@ -3735,7 +3735,7 @@
         </w:rPr>
         <w:t xml:space="preserve">Để bảo đảm tính khả thi và giảm thiểu rủi ro khi áp dụng đại trà, Đề tài đề xuất thực hiện thí điểm quy trình rà soát bộc lộ công khai bắt buộc tại khâu nghiệm thu đề tài (Khâu 4 của Quy trình 8 khâu) trước khi trình ban hành quy chế chính thức. Phạm vi thí điểm: </w:t>
       </w:r>
-      <w:del w:id="1091" w:author="Claude" w:date="2026-09-30T18:55:31Z">
+      <w:del w:id="1091" w:author="Claude" w:date="2026-09-30T19:14:55Z">
         <w:r>
           <w:rPr>
             <w:rFonts w:ascii="Times New Roman" w:hAnsi="Times New Roman" w:eastAsia="Times New Roman"/>
@@ -3746,7 +3746,7 @@
           <w:delText xml:space="preserve">áp dụng đối với các đề tài cấp cơ sở nghiệm thu trong kỳ 1 năm học 2025 - 2026 tại Viện Nghiên cứu giáo dục và Chuyển giao tri thức.</w:delText>
         </w:r>
       </w:del>
-      <w:ins w:id="1092" w:author="Claude" w:date="2026-09-30T18:55:31Z">
+      <w:ins w:id="1092" w:author="Claude" w:date="2026-09-30T19:14:55Z">
         <w:r>
           <w:rPr>
             <w:rFonts w:ascii="Times New Roman" w:hAnsi="Times New Roman" w:eastAsia="Times New Roman"/>
@@ -3812,7 +3812,7 @@
         <w:ind w:firstLine="720"/>
         <w:jc w:val="both"/>
       </w:pPr>
-      <w:del w:id="1093" w:author="Claude" w:date="2026-09-30T18:55:31Z">
+      <w:del w:id="1093" w:author="Claude" w:date="2026-09-30T19:14:55Z">
         <w:r>
           <w:rPr>
             <w:rFonts w:ascii="Times New Roman" w:hAnsi="Times New Roman" w:eastAsia="Times New Roman"/>
@@ -3823,7 +3823,7 @@
           <w:delText>Kết quả mô phỏng trên đề tài chiết xuất dược liệu năm 2026 cho thấy khâu rà soát bắt buộc giúp kịp thời nhận diện quy trình chiết tách có tính mới, kích hoạt ngay bước tra cứu sáng chế tiền kiểm và hỗ trợ chủ nhiệm đề tài hoàn thiện hồ sơ nộp đơn đăng ký trước khi công bố bài báo khoa học. Nếu không có khâu rà soát bắt buộc này, chủ nhiệm đề tài đã công bố bài báo trước, dẫn đến bộc lộ công khai quy trình chiết tách và mất hoàn toàn khả năng đăng ký sáng chế.</w:delText>
         </w:r>
       </w:del>
-      <w:ins w:id="1094" w:author="Claude" w:date="2026-09-30T18:55:31Z">
+      <w:ins w:id="1094" w:author="Claude" w:date="2026-09-30T19:14:55Z">
         <w:r>
           <w:rPr>
             <w:rFonts w:ascii="Times New Roman" w:hAnsi="Times New Roman" w:eastAsia="Times New Roman"/>
@@ -3841,7 +3841,7 @@
         <w:ind w:firstLine="720"/>
         <w:jc w:val="both"/>
       </w:pPr>
-      <w:del w:id="1095" w:author="Claude" w:date="2026-09-30T18:55:31Z">
+      <w:del w:id="1095" w:author="Claude" w:date="2026-09-30T19:14:55Z">
         <w:r>
           <w:rPr>
             <w:rFonts w:ascii="Times New Roman" w:hAnsi="Times New Roman" w:eastAsia="Times New Roman"/>
@@ -3852,7 +3852,7 @@
           <w:delText xml:space="preserve">Bài học kinh nghiệm rút ra từ việc thí điểm:</w:delText>
         </w:r>
       </w:del>
-      <w:ins w:id="1096" w:author="Claude" w:date="2026-09-30T18:55:31Z">
+      <w:ins w:id="1096" w:author="Claude" w:date="2026-09-30T19:14:55Z">
         <w:r>
           <w:rPr>
             <w:rFonts w:ascii="Times New Roman" w:hAnsi="Times New Roman" w:eastAsia="Times New Roman"/>
@@ -3872,7 +3872,7 @@
         </w:rPr>
         <w:t xml:space="preserve"> Thứ nhất, việc gắn trách nhiệm rà soát bộc lộ công khai vào biên bản nghiệm thu là mắt xích quyết định để chuyển từ quản lý thụ động sang chủ động đồng hành. </w:t>
       </w:r>
-      <w:del w:id="1097" w:author="Claude" w:date="2026-09-30T18:55:31Z">
+      <w:del w:id="1097" w:author="Claude" w:date="2026-09-30T19:14:55Z">
         <w:r>
           <w:rPr>
             <w:rFonts w:ascii="Times New Roman" w:hAnsi="Times New Roman" w:eastAsia="Times New Roman"/>
@@ -3883,7 +3883,7 @@
           <w:delText xml:space="preserve">Thứ hai, thời gian bổ sung cho mỗi phiên nghiệm thu chỉ tăng thêm khoảng 15 đến 20 phút, hoàn toàn khả thi trong thực tế.</w:delText>
         </w:r>
       </w:del>
-      <w:ins w:id="1098" w:author="Claude" w:date="2026-09-30T18:55:31Z">
+      <w:ins w:id="1098" w:author="Claude" w:date="2026-09-30T19:14:55Z">
         <w:r>
           <w:rPr>
             <w:rFonts w:ascii="Times New Roman" w:hAnsi="Times New Roman" w:eastAsia="Times New Roman"/>
@@ -4087,7 +4087,7 @@
         </w:rPr>
         <w:t xml:space="preserve">- </w:t>
       </w:r>
-      <w:del w:id="1099" w:author="Claude" w:date="2026-09-30T18:55:31Z">
+      <w:del w:id="1099" w:author="Claude" w:date="2026-09-30T19:14:55Z">
         <w:r>
           <w:rPr>
             <w:rFonts w:ascii="Times New Roman" w:hAnsi="Times New Roman" w:eastAsia="Times New Roman"/>
@@ -4098,7 +4098,7 @@
           <w:delText xml:space="preserve">Thực hiện thí điểm mô hình rà soát bộc lộ bắt buộc tại Viện Nghiên cứu giáo dục và Chuyển giao tri thức.</w:delText>
         </w:r>
       </w:del>
-      <w:ins w:id="1100" w:author="Claude" w:date="2026-09-30T18:55:31Z">
+      <w:ins w:id="1100" w:author="Claude" w:date="2026-09-30T19:14:55Z">
         <w:r>
           <w:rPr>
             <w:rFonts w:ascii="Times New Roman" w:hAnsi="Times New Roman" w:eastAsia="Times New Roman"/>
@@ -4213,7 +4213,7 @@
         </w:rPr>
         <w:t xml:space="preserve">- </w:t>
       </w:r>
-      <w:del w:id="1101" w:author="Claude" w:date="2026-09-30T18:55:31Z">
+      <w:del w:id="1101" w:author="Claude" w:date="2026-09-30T19:14:55Z">
         <w:r>
           <w:rPr>
             <w:rFonts w:ascii="Times New Roman" w:hAnsi="Times New Roman" w:eastAsia="Times New Roman"/>
@@ -4224,7 +4224,7 @@
           <w:delText xml:space="preserve">Chuẩn bị nội dung tham gia Đề án gắn sở hữu trí tuệ với giáo dục đại học do Bộ Giáo dục và Đào tạo dự thảo vào quý 2 năm 2027.</w:delText>
         </w:r>
       </w:del>
-      <w:ins w:id="1102" w:author="Claude" w:date="2026-09-30T18:55:31Z">
+      <w:ins w:id="1102" w:author="Claude" w:date="2026-09-30T19:14:55Z">
         <w:r>
           <w:rPr>
             <w:rFonts w:ascii="Times New Roman" w:hAnsi="Times New Roman" w:eastAsia="Times New Roman"/>
@@ -4323,7 +4323,7 @@
         </w:rPr>
         <w:t xml:space="preserve">- </w:t>
       </w:r>
-      <w:del w:id="1103" w:author="Claude" w:date="2026-09-30T18:55:31Z">
+      <w:del w:id="1103" w:author="Claude" w:date="2026-09-30T19:14:55Z">
         <w:r>
           <w:rPr>
             <w:rFonts w:ascii="Times New Roman" w:hAnsi="Times New Roman" w:eastAsia="Times New Roman"/>
@@ -4334,7 +4334,7 @@
           <w:delText xml:space="preserve">Kết nối Nhà trường với Mạng lưới Trung tâm Hỗ trợ công nghệ và đổi mới sáng tạo.</w:delText>
         </w:r>
       </w:del>
-      <w:ins w:id="1104" w:author="Claude" w:date="2026-09-30T18:55:31Z">
+      <w:ins w:id="1104" w:author="Claude" w:date="2026-09-30T19:14:55Z">
         <w:r>
           <w:rPr>
             <w:rFonts w:ascii="Times New Roman" w:hAnsi="Times New Roman" w:eastAsia="Times New Roman"/>
@@ -4425,7 +4425,7 @@
         </w:rPr>
         <w:t xml:space="preserve">Để đo lường hiệu quả triển khai hệ thống giải pháp, Đề tài đề xuất Bộ chỉ số theo dõi đánh giá hiệu quả gắn với từng nhóm giải pháp, được tổng hợp tại Bảng 3.2 dưới đây. Các chỉ số này được sử dụng làm căn cứ đánh giá hiệu quả hoạt động sở hữu trí tuệ của Nhà trường </w:t>
       </w:r>
-      <w:del w:id="1105" w:author="Claude" w:date="2026-09-30T18:55:31Z">
+      <w:del w:id="1105" w:author="Claude" w:date="2026-09-30T19:14:55Z">
         <w:r>
           <w:rPr>
             <w:rFonts w:ascii="Times New Roman" w:hAnsi="Times New Roman" w:eastAsia="Times New Roman"/>
@@ -4436,7 +4436,7 @@
           <w:delText xml:space="preserve">theo yêu cầu tại điểm b khoản 4 Quyết định số 1624/QĐ-TTg.</w:delText>
         </w:r>
       </w:del>
-      <w:ins w:id="1106" w:author="Claude" w:date="2026-09-30T18:55:31Z">
+      <w:ins w:id="1106" w:author="Claude" w:date="2026-09-30T19:14:55Z">
         <w:r>
           <w:rPr>
             <w:rFonts w:ascii="Times New Roman" w:hAnsi="Times New Roman" w:eastAsia="Times New Roman"/>
@@ -4590,7 +4590,7 @@
               <w:jc w:val="left"/>
             </w:pPr>
             <w:r/>
-            <w:del w:id="1107" w:author="Claude" w:date="2026-09-30T18:55:31Z">
+            <w:del w:id="1107" w:author="Claude" w:date="2026-09-30T19:14:55Z">
               <w:r>
                 <w:rPr>
                   <w:rFonts w:ascii="Times New Roman" w:hAnsi="Times New Roman" w:eastAsia="Times New Roman"/>
@@ -4607,7 +4607,7 @@
                 <w:delText>93/2025/QH15)</w:delText>
               </w:r>
             </w:del>
-            <w:ins w:id="1108" w:author="Claude" w:date="2026-09-30T18:55:31Z">
+            <w:ins w:id="1108" w:author="Claude" w:date="2026-09-30T19:14:55Z">
               <w:r>
                 <w:rPr>
                   <w:rFonts w:ascii="Times New Roman" w:hAnsi="Times New Roman" w:eastAsia="Times New Roman"/>
@@ -4952,7 +4952,7 @@
         </w:rPr>
         <w:t xml:space="preserve">Bộ chỉ số nêu trên được thiết kế theo nguyên tắc đo lường được, có thời hạn cụ thể và gắn trực tiếp với trách nhiệm của từng đơn vị trong Cơ chế phối hợp liên phòng ban. Ban Giám hiệu giao </w:t>
       </w:r>
-      <w:del w:id="1061" w:author="Claude" w:date="2026-09-30T18:55:31Z">
+      <w:del w:id="1061" w:author="Claude" w:date="2026-09-30T19:14:55Z">
         <w:r>
           <w:rPr>
             <w:rFonts w:ascii="Times New Roman" w:hAnsi="Times New Roman" w:eastAsia="Times New Roman"/>
@@ -4963,7 +4963,7 @@
           <w:delText xml:space="preserve">Phòng Quản lý Khoa học và Công nghệ</w:delText>
         </w:r>
       </w:del>
-      <w:ins w:id="1062" w:author="Claude" w:date="2026-09-30T18:55:31Z">
+      <w:ins w:id="1062" w:author="Claude" w:date="2026-09-30T19:14:55Z">
         <w:r>
           <w:rPr>
             <w:rFonts w:ascii="Times New Roman" w:hAnsi="Times New Roman" w:eastAsia="Times New Roman"/>

</xml_diff>